<commit_message>
Revisa comentarios de scripts SQL, actualiza manuales y agrega inicio del frontend para celular
</commit_message>
<xml_diff>
--- a/docs/manuales/Manual_Tecnico_Proveedores_Compras.docx
+++ b/docs/manuales/Manual_Tecnico_Proveedores_Compras.docx
@@ -205,7 +205,7 @@
           <w:sz w:val="22"/>
           <w:szCs w:val="22"/>
         </w:rPr>
-        <w:t xml:space="preserve">Sara — [escriba nombre completo y carné]</w:t>
+        <w:t xml:space="preserve">Betty Sarai Parada Pineda — 7490-23-7697</w:t>
       </w:r>
     </w:p>
     <w:p>
@@ -325,7 +325,7 @@
           <w:sz w:val="22"/>
           <w:szCs w:val="22"/>
         </w:rPr>
-        <w:t xml:space="preserve"> a cargo de Sara: los módulos </w:t>
+        <w:t xml:space="preserve"> a cargo de Betty Sarai Parada Pineda: los módulos </w:t>
       </w:r>
       <w:r>
         <w:rPr>
@@ -943,7 +943,7 @@
           <w:sz w:val="22"/>
           <w:szCs w:val="22"/>
         </w:rPr>
-        <w:t xml:space="preserve">: pertenece al módulo de Inventarios de Fernando y se reemplazará por su API al integrar.</w:t>
+        <w:t xml:space="preserve">: es la base del módulo de Inventarios del ERP y se conectará con él al integrar.</w:t>
       </w:r>
     </w:p>
     <w:p>
@@ -4464,7 +4464,7 @@
           <w:sz w:val="18"/>
           <w:szCs w:val="18"/>
         </w:rPr>
-        <w:t xml:space="preserve">├── scripts/configurar-secretos.ps1</w:t>
+        <w:t xml:space="preserve">├── scripts/Secretitos.ps1</w:t>
       </w:r>
     </w:p>
     <w:p>
@@ -4943,7 +4943,7 @@
           <w:sz w:val="20"/>
           <w:szCs w:val="20"/>
         </w:rPr>
-        <w:t xml:space="preserve">scripts/configurar-secretos.ps1</w:t>
+        <w:t xml:space="preserve">scripts/Secretitos.ps1</w:t>
       </w:r>
       <w:r>
         <w:rPr>
@@ -6616,7 +6616,7 @@
                 <w:sz w:val="22"/>
                 <w:szCs w:val="22"/>
               </w:rPr>
-              <w:t xml:space="preserve">Bodegas, Productos, Existencias, MovimientosInventario (se reemplaza por el módulo de Fernando)</w:t>
+              <w:t xml:space="preserve">Bodegas, Productos, Existencias, MovimientosInventario (se integra con el módulo de Inventarios)</w:t>
             </w:r>
           </w:p>
         </w:tc>

</xml_diff>